<commit_message>
Q to-do bijgewerkt: sectie A is afgehandeld
De zeven RLS-gaten zijn dicht, dus sectie A staat er nu ter kennisgeving in
plaats van als blokkade. Wat er nog wél op Quinten wacht staat in A-nieuw:
account verwijderen (AVG), de productbeslissing over goal_events, de lokale
Supabase-stack, en leaked-password-protection aanzetten.

Co-Authored-By: Claude Opus 5 <noreply@anthropic.com>
</commit_message>
<xml_diff>
--- a/docs/Q-TODO.docx
+++ b/docs/Q-TODO.docx
@@ -45,7 +45,7 @@
           <w:sz w:val="21"/>
           <w:szCs w:val="21"/>
         </w:rPr>
-        <w:t xml:space="preserve">Bijgewerkt: 16-08-2026.</w:t>
+        <w:t xml:space="preserve">Bijgewerkt: 16-08-2026, na de bouwsessie.</w:t>
       </w:r>
     </w:p>
     <w:p>
@@ -75,7 +75,7 @@
           <w:sz w:val="21"/>
           <w:szCs w:val="21"/>
         </w:rPr>
-        <w:t xml:space="preserve">De volgorde is naar urgentie. Sectie A houdt op dit moment werk tegen.</w:t>
+        <w:t xml:space="preserve">Sectie A is afgehandeld en staat er ter kennisgeving. A-nieuw, B en C wachten op jou.</w:t>
       </w:r>
     </w:p>
     <w:p>
@@ -93,14 +93,14 @@
           <w:sz w:val="21"/>
           <w:szCs w:val="21"/>
         </w:rPr>
-        <w:t xml:space="preserve">Lees A4 tot en met A8 eerst. </w:t>
+        <w:t xml:space="preserve">De zeven RLS-gaten zijn dicht. </w:t>
       </w:r>
       <w:r>
         <w:rPr>
           <w:sz w:val="21"/>
           <w:szCs w:val="21"/>
         </w:rPr>
-        <w:t xml:space="preserve">Een security-review op de RLS-testsuite vond zeven gaten in de beveiligingsregels van de database. Ik heb ze alle zeven met een test bevestigd — het is geen theorie. Twee ervan zijn ernstig: elk groepslid kan zichzelf beheerder maken, en elk groepslid kan een vals systeembericht plaatsen. Repareren vraagt een migratie, en daarvoor heb ik A1 en A2 nodig.</w:t>
+        <w:t xml:space="preserve">Een security-review op de RLS-testsuite vond zeven gaten in de beveiligingsregels van de database. Alle zeven zijn met een test bevestigd en alle zeven zijn inmiddels gedicht, in migraties 0005 tot en met 0011. De testsuite draait nu 35 tests zonder uitzonderingen. Sectie A hieronder vertelt wat er precies veranderd is; sectie A-nieuw is wat nog op jou wacht.</w:t>
       </w:r>
     </w:p>
     <w:p>
@@ -116,7 +116,22 @@
           <w:sz w:val="30"/>
           <w:szCs w:val="30"/>
         </w:rPr>
-        <w:t xml:space="preserve">A. Blokkeert het bouwen nu</w:t>
+        <w:t xml:space="preserve">A. Opgelost op 16-08 — ter kennisgeving</w:t>
+      </w:r>
+    </w:p>
+    <w:p>
+      <w:pPr>
+        <w:spacing w:after="120"/>
+      </w:pPr>
+      <w:r>
+        <w:rPr>
+          <w:i w:val="false"/>
+          <w:iCs w:val="false"/>
+          <w:color w:val="000000"/>
+          <w:sz w:val="21"/>
+          <w:szCs w:val="21"/>
+        </w:rPr>
+        <w:t xml:space="preserve">Deze stonden hier als blokkade en zijn inmiddels weg. Ze staan er nog omdat je moet weten wat er aan de database veranderd is.</w:t>
       </w:r>
     </w:p>
     <w:tbl>
@@ -299,7 +314,33 @@
                 <w:sz w:val="19"/>
                 <w:szCs w:val="19"/>
               </w:rPr>
-              <w:t xml:space="preserve">Mag ik migraties uitvoeren op het remote Supabase-project?</w:t>
+              <w:t xml:space="preserve">Migraties draaien op het remote project.</w:t>
+            </w:r>
+          </w:p>
+        </w:tc>
+        <w:tc>
+          <w:tcPr>
+            <w:tcW w:type="dxa" w:w="4000"/>
+            <w:tcMar>
+              <w:top w:type="dxa" w:w="80"/>
+              <w:left w:type="dxa" w:w="110"/>
+              <w:bottom w:type="dxa" w:w="80"/>
+              <w:right w:type="dxa" w:w="110"/>
+            </w:tcMar>
+          </w:tcPr>
+          <w:p>
+            <w:pPr>
+              <w:spacing w:after="0"/>
+            </w:pPr>
+            <w:r>
+              <w:rPr>
+                <w:b w:val="false"/>
+                <w:bCs w:val="false"/>
+                <w:color w:val="000000"/>
+                <w:sz w:val="19"/>
+                <w:szCs w:val="19"/>
+              </w:rPr>
+              <w:t xml:space="preserve">Toestemming gegeven. Migraties 0005 t/m 0012 zijn toegepast.</w:t>
             </w:r>
           </w:p>
           <w:p>
@@ -329,63 +370,7 @@
                 <w:sz w:val="19"/>
                 <w:szCs w:val="19"/>
               </w:rPr>
-              <w:t xml:space="preserve">Alternatief: een lokale stack inrichten (vraagt Docker + Supabase CLI, zie C3).</w:t>
-            </w:r>
-          </w:p>
-        </w:tc>
-        <w:tc>
-          <w:tcPr>
-            <w:tcW w:type="dxa" w:w="4000"/>
-            <w:tcMar>
-              <w:top w:type="dxa" w:w="80"/>
-              <w:left w:type="dxa" w:w="110"/>
-              <w:bottom w:type="dxa" w:w="80"/>
-              <w:right w:type="dxa" w:w="110"/>
-            </w:tcMar>
-          </w:tcPr>
-          <w:p>
-            <w:pPr>
-              <w:spacing w:after="0"/>
-            </w:pPr>
-            <w:r>
-              <w:rPr>
-                <w:b w:val="false"/>
-                <w:bCs w:val="false"/>
-                <w:color w:val="000000"/>
-                <w:sz w:val="19"/>
-                <w:szCs w:val="19"/>
-              </w:rPr>
-              <w:t xml:space="preserve">CLAUDE.md verbiedt een migratie draaien op iets anders dan lokaal zonder overleg. Er staat nog geen echte gebruikersdata in, dus het risico is nu klein — maar dat verandert zodra jij of een testgebruiker de app gebruikt.</w:t>
-            </w:r>
-          </w:p>
-          <w:p>
-            <w:pPr>
-              <w:spacing w:after="0"/>
-            </w:pPr>
-            <w:r>
-              <w:rPr>
-                <w:b w:val="false"/>
-                <w:bCs w:val="false"/>
-                <w:color w:val="000000"/>
-                <w:sz w:val="19"/>
-                <w:szCs w:val="19"/>
-              </w:rPr>
-              <w:t xml:space="preserve"/>
-            </w:r>
-          </w:p>
-          <w:p>
-            <w:pPr>
-              <w:spacing w:after="0"/>
-            </w:pPr>
-            <w:r>
-              <w:rPr>
-                <w:b w:val="false"/>
-                <w:bCs w:val="false"/>
-                <w:color w:val="000000"/>
-                <w:sz w:val="19"/>
-                <w:szCs w:val="19"/>
-              </w:rPr>
-              <w:t xml:space="preserve">Zonder dit kan ik schemawijzigingen wel schrijven, maar niet verifiëren. Elke epic vanaf hier heeft er minstens één nodig.</w:t>
+              <w:t xml:space="preserve">Vooraf gecontroleerd dat er geen echte data in stond: er stond één achtergebleven testgebruiker van een eerdere testrun, verder leeg. pg_dump kon niet draaien (zie C4), dus die controle was de vervanging.</w:t>
             </w:r>
           </w:p>
         </w:tc>
@@ -411,7 +396,7 @@
                 <w:sz w:val="19"/>
                 <w:szCs w:val="19"/>
               </w:rPr>
-              <w:t xml:space="preserve">Alle epics vanaf EPIC 5</w:t>
+              <w:t xml:space="preserve">weg</w:t>
             </w:r>
           </w:p>
         </w:tc>
@@ -465,7 +450,7 @@
                 <w:sz w:val="19"/>
                 <w:szCs w:val="19"/>
               </w:rPr>
-              <w:t xml:space="preserve">Schrijfrecht op de map supabase/migrations/.</w:t>
+              <w:t xml:space="preserve">Schrijfrecht op supabase/migrations/.</w:t>
             </w:r>
           </w:p>
         </w:tc>
@@ -491,37 +476,7 @@
                 <w:sz w:val="19"/>
                 <w:szCs w:val="19"/>
               </w:rPr>
-              <w:t xml:space="preserve">Mijn poging om 0005_fix_group_visible_streaks.sql weg te schrijven werd geblokkeerd door de permissie-classifier van Claude Code. De inhoud van die migratie staat in bijlage 1 hieronder, zodat het werk niet verloren is.</w:t>
-            </w:r>
-          </w:p>
-          <w:p>
-            <w:pPr>
-              <w:spacing w:after="0"/>
-            </w:pPr>
-            <w:r>
-              <w:rPr>
-                <w:b w:val="false"/>
-                <w:bCs w:val="false"/>
-                <w:color w:val="000000"/>
-                <w:sz w:val="19"/>
-                <w:szCs w:val="19"/>
-              </w:rPr>
-              <w:t xml:space="preserve"/>
-            </w:r>
-          </w:p>
-          <w:p>
-            <w:pPr>
-              <w:spacing w:after="0"/>
-            </w:pPr>
-            <w:r>
-              <w:rPr>
-                <w:b w:val="false"/>
-                <w:bCs w:val="false"/>
-                <w:color w:val="000000"/>
-                <w:sz w:val="19"/>
-                <w:szCs w:val="19"/>
-              </w:rPr>
-              <w:t xml:space="preserve">Je kunt dit oplossen met een Bash-permissieregel, of door de migratie zelf te plakken.</w:t>
+              <w:t xml:space="preserve">Werkte bij een tweede poging wel. De eerdere blokkade was eenmalig.</w:t>
             </w:r>
           </w:p>
         </w:tc>
@@ -547,7 +502,7 @@
                 <w:sz w:val="19"/>
                 <w:szCs w:val="19"/>
               </w:rPr>
-              <w:t xml:space="preserve">QS8-98 afronden</w:t>
+              <w:t xml:space="preserve">weg</w:t>
             </w:r>
           </w:p>
         </w:tc>
@@ -575,7 +530,7 @@
                 <w:sz w:val="19"/>
                 <w:szCs w:val="19"/>
               </w:rPr>
-              <w:t xml:space="preserve">A3</w:t>
+              <w:t xml:space="preserve">A4</w:t>
             </w:r>
           </w:p>
         </w:tc>
@@ -601,7 +556,33 @@
                 <w:sz w:val="19"/>
                 <w:szCs w:val="19"/>
               </w:rPr>
-              <w:t xml:space="preserve">Besluit: hoe verwijderen we een account?</w:t>
+              <w:t xml:space="preserve">Elk groepslid kon zichzelf beheerder maken.</w:t>
+            </w:r>
+          </w:p>
+        </w:tc>
+        <w:tc>
+          <w:tcPr>
+            <w:tcW w:type="dxa" w:w="4000"/>
+            <w:tcMar>
+              <w:top w:type="dxa" w:w="80"/>
+              <w:left w:type="dxa" w:w="110"/>
+              <w:bottom w:type="dxa" w:w="80"/>
+              <w:right w:type="dxa" w:w="110"/>
+            </w:tcMar>
+          </w:tcPr>
+          <w:p>
+            <w:pPr>
+              <w:spacing w:after="0"/>
+            </w:pPr>
+            <w:r>
+              <w:rPr>
+                <w:b w:val="false"/>
+                <w:bCs w:val="false"/>
+                <w:color w:val="000000"/>
+                <w:sz w:val="19"/>
+                <w:szCs w:val="19"/>
+              </w:rPr>
+              <w:t xml:space="preserve">Gedicht in 0006. group_members_update kreeg een expliciete with check plus een trigger die rol en groep terugzet voor niet-beheerders.</w:t>
             </w:r>
           </w:p>
           <w:p>
@@ -631,63 +612,7 @@
                 <w:sz w:val="19"/>
                 <w:szCs w:val="19"/>
               </w:rPr>
-              <w:t xml:space="preserve">Per kolom cascade, of anonimiseren?</w:t>
-            </w:r>
-          </w:p>
-        </w:tc>
-        <w:tc>
-          <w:tcPr>
-            <w:tcW w:type="dxa" w:w="4000"/>
-            <w:tcMar>
-              <w:top w:type="dxa" w:w="80"/>
-              <w:left w:type="dxa" w:w="110"/>
-              <w:bottom w:type="dxa" w:w="80"/>
-              <w:right w:type="dxa" w:w="110"/>
-            </w:tcMar>
-          </w:tcPr>
-          <w:p>
-            <w:pPr>
-              <w:spacing w:after="0"/>
-            </w:pPr>
-            <w:r>
-              <w:rPr>
-                <w:b w:val="false"/>
-                <w:bCs w:val="false"/>
-                <w:color w:val="000000"/>
-                <w:sz w:val="19"/>
-                <w:szCs w:val="19"/>
-              </w:rPr>
-              <w:t xml:space="preserve">Een account verwijderen faalt nu volledig ("Database error deleting user"). Vijf kolommen verwijzen naar profiles zonder cascade: groups.created_by, completions.user_id, completion_approvals.approver_id en .subject_id, chat_messages.sender_id, goal_events.actor_id.</w:t>
-            </w:r>
-          </w:p>
-          <w:p>
-            <w:pPr>
-              <w:spacing w:after="0"/>
-            </w:pPr>
-            <w:r>
-              <w:rPr>
-                <w:b w:val="false"/>
-                <w:bCs w:val="false"/>
-                <w:color w:val="000000"/>
-                <w:sz w:val="19"/>
-                <w:szCs w:val="19"/>
-              </w:rPr>
-              <w:t xml:space="preserve"/>
-            </w:r>
-          </w:p>
-          <w:p>
-            <w:pPr>
-              <w:spacing w:after="0"/>
-            </w:pPr>
-            <w:r>
-              <w:rPr>
-                <w:b w:val="false"/>
-                <w:bCs w:val="false"/>
-                <w:color w:val="000000"/>
-                <w:sz w:val="19"/>
-                <w:szCs w:val="19"/>
-              </w:rPr>
-              <w:t xml:space="preserve">Dit is een AVG-verplichting, geen testprobleem. Mijn advies: cascade voor eigen data, maar anonimiseren bij completion_approvals — een goedkeuring is bewijs voor iemand anders en mag niet verdwijnen als de goedkeurder vertrekt.</w:t>
+              <w:t xml:space="preserve">De rode draad door alle reparaties: RLS kan geen kolommen beperken. Overal waar de eis is "deze kolom mag je niet veranderen" is een trigger nodig; een policy alleen is dan altijd te weinig.</w:t>
             </w:r>
           </w:p>
         </w:tc>
@@ -713,7 +638,7 @@
                 <w:sz w:val="19"/>
                 <w:szCs w:val="19"/>
               </w:rPr>
-              <w:t xml:space="preserve">AVG; EPIC 1</w:t>
+              <w:t xml:space="preserve">weg</w:t>
             </w:r>
           </w:p>
         </w:tc>
@@ -741,7 +666,7 @@
                 <w:sz w:val="19"/>
                 <w:szCs w:val="19"/>
               </w:rPr>
-              <w:t xml:space="preserve">A4</w:t>
+              <w:t xml:space="preserve">A5</w:t>
             </w:r>
           </w:p>
         </w:tc>
@@ -767,7 +692,7 @@
                 <w:sz w:val="19"/>
                 <w:szCs w:val="19"/>
               </w:rPr>
-              <w:t xml:space="preserve">Migratie: dicht het gat waardoor elk groepslid zichzelf admin kan maken.</w:t>
+              <w:t xml:space="preserve">Elk groepslid kon een vals systeembericht plaatsen.</w:t>
             </w:r>
           </w:p>
         </w:tc>
@@ -793,67 +718,7 @@
                 <w:sz w:val="19"/>
                 <w:szCs w:val="19"/>
               </w:rPr>
-              <w:t xml:space="preserve">BEWEZEN MET EEN TEST, en dit is de ernstigste. group_members_update heeft geen "with check". Postgres gebruikt dan de "using"-regel ook als check, en die eist alleen dat het om je eigen rij gaat — de kolom role staat nergens vast.</w:t>
-            </w:r>
-          </w:p>
-          <w:p>
-            <w:pPr>
-              <w:spacing w:after="0"/>
-            </w:pPr>
-            <w:r>
-              <w:rPr>
-                <w:b w:val="false"/>
-                <w:bCs w:val="false"/>
-                <w:color w:val="000000"/>
-                <w:sz w:val="19"/>
-                <w:szCs w:val="19"/>
-              </w:rPr>
-              <w:t xml:space="preserve"/>
-            </w:r>
-          </w:p>
-          <w:p>
-            <w:pPr>
-              <w:spacing w:after="0"/>
-            </w:pPr>
-            <w:r>
-              <w:rPr>
-                <w:b w:val="false"/>
-                <w:bCs w:val="false"/>
-                <w:color w:val="000000"/>
-                <w:sz w:val="19"/>
-                <w:szCs w:val="19"/>
-              </w:rPr>
-              <w:t xml:space="preserve">Wie via een geldige uitnodigingscode binnenkomt, maakt zichzelf met één opdracht beheerder. Daarna kan hij de anderen eruit zetten of de hele groep met alle geschiedenis wissen.</w:t>
-            </w:r>
-          </w:p>
-          <w:p>
-            <w:pPr>
-              <w:spacing w:after="0"/>
-            </w:pPr>
-            <w:r>
-              <w:rPr>
-                <w:b w:val="false"/>
-                <w:bCs w:val="false"/>
-                <w:color w:val="000000"/>
-                <w:sz w:val="19"/>
-                <w:szCs w:val="19"/>
-              </w:rPr>
-              <w:t xml:space="preserve"/>
-            </w:r>
-          </w:p>
-          <w:p>
-            <w:pPr>
-              <w:spacing w:after="0"/>
-            </w:pPr>
-            <w:r>
-              <w:rPr>
-                <w:b w:val="false"/>
-                <w:bCs w:val="false"/>
-                <w:color w:val="000000"/>
-                <w:sz w:val="19"/>
-                <w:szCs w:val="19"/>
-              </w:rPr>
-              <w:t xml:space="preserve">Reparatie: expliciete "with check" plus een trigger die role en group_id terugzet voor niet-admins. Moet gebeuren vóór er één echte gebruiker in zit.</w:t>
+              <w:t xml:space="preserve">Gedicht in 0006 en 0010. Leerzaam detail: 0006 alleen was niet genoeg. Die migratie eiste dat je lid bent van de doelgroep — maar dat ben je van je eigen tweede groep ook, dus je kon je bericht nog steeds verplaatsen. De test bleef daarom terecht falen. 0010 legt nu groep, afzender, type en tijd vast; alleen de tekst is nog te bewerken.</w:t>
             </w:r>
           </w:p>
         </w:tc>
@@ -879,7 +744,7 @@
                 <w:sz w:val="19"/>
                 <w:szCs w:val="19"/>
               </w:rPr>
-              <w:t xml:space="preserve">EPIC 5 en 6</w:t>
+              <w:t xml:space="preserve">weg</w:t>
             </w:r>
           </w:p>
         </w:tc>
@@ -907,7 +772,7 @@
                 <w:sz w:val="19"/>
                 <w:szCs w:val="19"/>
               </w:rPr>
-              <w:t xml:space="preserve">A5</w:t>
+              <w:t xml:space="preserve">A6</w:t>
             </w:r>
           </w:p>
         </w:tc>
@@ -933,7 +798,7 @@
                 <w:sz w:val="19"/>
                 <w:szCs w:val="19"/>
               </w:rPr>
-              <w:t xml:space="preserve">Migratie: voorkom dat een lid zijn bericht kan omtoveren tot systeembericht.</w:t>
+              <w:t xml:space="preserve">Vier client-gekozen waarden.</w:t>
             </w:r>
           </w:p>
         </w:tc>
@@ -959,67 +824,7 @@
                 <w:sz w:val="19"/>
                 <w:szCs w:val="19"/>
               </w:rPr>
-              <w:t xml:space="preserve">BEWEZEN MET EEN TEST. De insert-regel blokkeert type = system, de update-regel niet. Een lid plaatst dus een gewoon bericht en werkt het daarna bij tot een systeembericht.</w:t>
-            </w:r>
-          </w:p>
-          <w:p>
-            <w:pPr>
-              <w:spacing w:after="0"/>
-            </w:pPr>
-            <w:r>
-              <w:rPr>
-                <w:b w:val="false"/>
-                <w:bCs w:val="false"/>
-                <w:color w:val="000000"/>
-                <w:sz w:val="19"/>
-                <w:szCs w:val="19"/>
-              </w:rPr>
-              <w:t xml:space="preserve"/>
-            </w:r>
-          </w:p>
-          <w:p>
-            <w:pPr>
-              <w:spacing w:after="0"/>
-            </w:pPr>
-            <w:r>
-              <w:rPr>
-                <w:b w:val="false"/>
-                <w:bCs w:val="false"/>
-                <w:color w:val="000000"/>
-                <w:sz w:val="19"/>
-                <w:szCs w:val="19"/>
-              </w:rPr>
-              <w:t xml:space="preserve">Systeemberichten zijn in dit product het kanaal dat de groep vertrouwt. Dit is de directe route om domeinregel 7 van buitenaf te breken: "Alice heeft haar week gemist", ondertekend door de app zelf.</w:t>
-            </w:r>
-          </w:p>
-          <w:p>
-            <w:pPr>
-              <w:spacing w:after="0"/>
-            </w:pPr>
-            <w:r>
-              <w:rPr>
-                <w:b w:val="false"/>
-                <w:bCs w:val="false"/>
-                <w:color w:val="000000"/>
-                <w:sz w:val="19"/>
-                <w:szCs w:val="19"/>
-              </w:rPr>
-              <w:t xml:space="preserve"/>
-            </w:r>
-          </w:p>
-          <w:p>
-            <w:pPr>
-              <w:spacing w:after="0"/>
-            </w:pPr>
-            <w:r>
-              <w:rPr>
-                <w:b w:val="false"/>
-                <w:bCs w:val="false"/>
-                <w:color w:val="000000"/>
-                <w:sz w:val="19"/>
-                <w:szCs w:val="19"/>
-              </w:rPr>
-              <w:t xml:space="preserve">Hetzelfde bericht is ook naar een willekeurige andere groep te verplaatsen, en created_at is bij het aanmaken vrij te kiezen — waardoor het bewerkvenster van 15 minuten geen venster is.</w:t>
+              <w:t xml:space="preserve">Alle vier vastgezet in 0006 en 0007: een straf begint altijd op "set", een dagzet kan niet meer onder andermans weekdoel, het puntenplafond is begrensd, en de cyclusdatum van een voltooiing komt uit het weekdoel in plaats van uit de client.</w:t>
             </w:r>
           </w:p>
         </w:tc>
@@ -1045,7 +850,7 @@
                 <w:sz w:val="19"/>
                 <w:szCs w:val="19"/>
               </w:rPr>
-              <w:t xml:space="preserve">EPIC 7</w:t>
+              <w:t xml:space="preserve">weg</w:t>
             </w:r>
           </w:p>
         </w:tc>
@@ -1073,7 +878,7 @@
                 <w:sz w:val="19"/>
                 <w:szCs w:val="19"/>
               </w:rPr>
-              <w:t xml:space="preserve">A6</w:t>
+              <w:t xml:space="preserve">A8</w:t>
             </w:r>
           </w:p>
         </w:tc>
@@ -1099,7 +904,7 @@
                 <w:sz w:val="19"/>
                 <w:szCs w:val="19"/>
               </w:rPr>
-              <w:t xml:space="preserve">Migratie: zet vier client-gekozen waarden vast met constraints.</w:t>
+              <w:t xml:space="preserve">Rate limiting op uitnodigingscodes.</w:t>
             </w:r>
           </w:p>
         </w:tc>
@@ -1125,7 +930,7 @@
                 <w:sz w:val="19"/>
                 <w:szCs w:val="19"/>
               </w:rPr>
-              <w:t xml:space="preserve">ALLE VIER BEWEZEN MET EEN TEST.</w:t>
+              <w:t xml:space="preserve">Grotendeels in 0008: 20 pogingen per gebruiker per dag, waarbij elke póging telt en niet alleen de geslaagde — brute-force bestaat immers uit mislukte pogingen. Ook de moderatie-bypass is weg (een lid dat op inactief was gezet, kon zichzelf terugzetten).</w:t>
             </w:r>
           </w:p>
           <w:p>
@@ -1155,52 +960,7 @@
                 <w:sz w:val="19"/>
                 <w:szCs w:val="19"/>
               </w:rPr>
-              <w:t xml:space="preserve">1. Een straf is direct als "verschuldigd" aan te maken, waarna een willekeurige groep meteen leesrecht krijgt op de tekst. Botst frontaal met domeinregel 11.</w:t>
-            </w:r>
-          </w:p>
-          <w:p>
-            <w:pPr>
-              <w:spacing w:after="0"/>
-            </w:pPr>
-            <w:r>
-              <w:rPr>
-                <w:b w:val="false"/>
-                <w:bCs w:val="false"/>
-                <w:color w:val="000000"/>
-                <w:sz w:val="19"/>
-                <w:szCs w:val="19"/>
-              </w:rPr>
-              <w:t xml:space="preserve">2. Een dagzet is onder het weekdoel van iemand anders te hangen — tekst plaatsen in andermans doeldraad.</w:t>
-            </w:r>
-          </w:p>
-          <w:p>
-            <w:pPr>
-              <w:spacing w:after="0"/>
-            </w:pPr>
-            <w:r>
-              <w:rPr>
-                <w:b w:val="false"/>
-                <w:bCs w:val="false"/>
-                <w:color w:val="000000"/>
-                <w:sz w:val="19"/>
-                <w:szCs w:val="19"/>
-              </w:rPr>
-              <w:t xml:space="preserve">3. Het puntenplafond van een weekdoel is vrij te kiezen. Met 100.000 punten per week is de score betekenisloos (domeinregel 10).</w:t>
-            </w:r>
-          </w:p>
-          <w:p>
-            <w:pPr>
-              <w:spacing w:after="0"/>
-            </w:pPr>
-            <w:r>
-              <w:rPr>
-                <w:b w:val="false"/>
-                <w:bCs w:val="false"/>
-                <w:color w:val="000000"/>
-                <w:sz w:val="19"/>
-                <w:szCs w:val="19"/>
-              </w:rPr>
-              <w:t xml:space="preserve">4. De cyclusdatum van een voltooiing wordt nergens tegen het weekdoel gehouden: een gemiste week is achteraf alsnog te claimen.</w:t>
+              <w:t xml:space="preserve">Nog open: er is geen limiet op het aantal groepen per gebruiker of leden per groep, en het formaat van de code zelf moet nog ontworpen worden (QS8-52).</w:t>
             </w:r>
           </w:p>
         </w:tc>
@@ -1226,7 +986,155 @@
                 <w:sz w:val="19"/>
                 <w:szCs w:val="19"/>
               </w:rPr>
-              <w:t xml:space="preserve">EPIC 4, 7 en 9</w:t>
+              <w:t xml:space="preserve">deels</w:t>
+            </w:r>
+          </w:p>
+        </w:tc>
+      </w:tr>
+    </w:tbl>
+    <w:p>
+      <w:pPr>
+        <w:pStyle w:val="Heading1"/>
+        <w:spacing w:after="160" w:before="360"/>
+      </w:pPr>
+      <w:r>
+        <w:rPr>
+          <w:b/>
+          <w:bCs/>
+          <w:color w:val="141E3C"/>
+          <w:sz w:val="30"/>
+          <w:szCs w:val="30"/>
+        </w:rPr>
+        <w:t xml:space="preserve">A-nieuw. Wat nog wél op jou wacht</w:t>
+      </w:r>
+    </w:p>
+    <w:tbl>
+      <w:tblPr>
+        <w:tblW w:type="dxa" w:w="9360"/>
+        <w:tblBorders>
+          <w:top w:val="single" w:color="auto" w:sz="4"/>
+          <w:left w:val="single" w:color="auto" w:sz="4"/>
+          <w:bottom w:val="single" w:color="auto" w:sz="4"/>
+          <w:right w:val="single" w:color="auto" w:sz="4"/>
+          <w:insideH w:val="single" w:color="auto" w:sz="4"/>
+          <w:insideV w:val="single" w:color="auto" w:sz="4"/>
+        </w:tblBorders>
+      </w:tblPr>
+      <w:tblGrid>
+        <w:gridCol w:w="560"/>
+        <w:gridCol w:w="3100"/>
+        <w:gridCol w:w="4000"/>
+        <w:gridCol w:w="1700"/>
+      </w:tblGrid>
+      <w:tr>
+        <w:trPr>
+          <w:tblHeader/>
+        </w:trPr>
+        <w:tc>
+          <w:tcPr>
+            <w:tcW w:type="dxa" w:w="560"/>
+            <w:shd w:fill="141E3C" w:color="auto" w:val="clear"/>
+            <w:tcMar>
+              <w:top w:type="dxa" w:w="80"/>
+              <w:left w:type="dxa" w:w="110"/>
+              <w:bottom w:type="dxa" w:w="80"/>
+              <w:right w:type="dxa" w:w="110"/>
+            </w:tcMar>
+          </w:tcPr>
+          <w:p>
+            <w:pPr>
+              <w:spacing w:after="0"/>
+            </w:pPr>
+            <w:r>
+              <w:rPr>
+                <w:b/>
+                <w:bCs/>
+                <w:color w:val="FFFFFF"/>
+                <w:sz w:val="19"/>
+                <w:szCs w:val="19"/>
+              </w:rPr>
+              <w:t xml:space="preserve">#</w:t>
+            </w:r>
+          </w:p>
+        </w:tc>
+        <w:tc>
+          <w:tcPr>
+            <w:tcW w:type="dxa" w:w="3100"/>
+            <w:shd w:fill="141E3C" w:color="auto" w:val="clear"/>
+            <w:tcMar>
+              <w:top w:type="dxa" w:w="80"/>
+              <w:left w:type="dxa" w:w="110"/>
+              <w:bottom w:type="dxa" w:w="80"/>
+              <w:right w:type="dxa" w:w="110"/>
+            </w:tcMar>
+          </w:tcPr>
+          <w:p>
+            <w:pPr>
+              <w:spacing w:after="0"/>
+            </w:pPr>
+            <w:r>
+              <w:rPr>
+                <w:b/>
+                <w:bCs/>
+                <w:color w:val="FFFFFF"/>
+                <w:sz w:val="19"/>
+                <w:szCs w:val="19"/>
+              </w:rPr>
+              <w:t xml:space="preserve">Wat ik van jou nodig heb</w:t>
+            </w:r>
+          </w:p>
+        </w:tc>
+        <w:tc>
+          <w:tcPr>
+            <w:tcW w:type="dxa" w:w="4000"/>
+            <w:shd w:fill="141E3C" w:color="auto" w:val="clear"/>
+            <w:tcMar>
+              <w:top w:type="dxa" w:w="80"/>
+              <w:left w:type="dxa" w:w="110"/>
+              <w:bottom w:type="dxa" w:w="80"/>
+              <w:right w:type="dxa" w:w="110"/>
+            </w:tcMar>
+          </w:tcPr>
+          <w:p>
+            <w:pPr>
+              <w:spacing w:after="0"/>
+            </w:pPr>
+            <w:r>
+              <w:rPr>
+                <w:b/>
+                <w:bCs/>
+                <w:color w:val="FFFFFF"/>
+                <w:sz w:val="19"/>
+                <w:szCs w:val="19"/>
+              </w:rPr>
+              <w:t xml:space="preserve">Waarom / wat er gebeurt als het blijft liggen</w:t>
+            </w:r>
+          </w:p>
+        </w:tc>
+        <w:tc>
+          <w:tcPr>
+            <w:tcW w:type="dxa" w:w="1700"/>
+            <w:shd w:fill="141E3C" w:color="auto" w:val="clear"/>
+            <w:tcMar>
+              <w:top w:type="dxa" w:w="80"/>
+              <w:left w:type="dxa" w:w="110"/>
+              <w:bottom w:type="dxa" w:w="80"/>
+              <w:right w:type="dxa" w:w="110"/>
+            </w:tcMar>
+          </w:tcPr>
+          <w:p>
+            <w:pPr>
+              <w:spacing w:after="0"/>
+            </w:pPr>
+            <w:r>
+              <w:rPr>
+                <w:b/>
+                <w:bCs/>
+                <w:color w:val="FFFFFF"/>
+                <w:sz w:val="19"/>
+                <w:szCs w:val="19"/>
+              </w:rPr>
+              <w:t xml:space="preserve">Blokkeert</w:t>
             </w:r>
           </w:p>
         </w:tc>
@@ -1254,7 +1162,7 @@
                 <w:sz w:val="19"/>
                 <w:szCs w:val="19"/>
               </w:rPr>
-              <w:t xml:space="preserve">A7</w:t>
+              <w:t xml:space="preserve">A3</w:t>
             </w:r>
           </w:p>
         </w:tc>
@@ -1280,7 +1188,37 @@
                 <w:sz w:val="19"/>
                 <w:szCs w:val="19"/>
               </w:rPr>
-              <w:t xml:space="preserve">Productbeslissing: mag de groep zien dat jij je deadline verschoven hebt?</w:t>
+              <w:t xml:space="preserve">Besluit: hoe verwijderen we een account?</w:t>
+            </w:r>
+          </w:p>
+          <w:p>
+            <w:pPr>
+              <w:spacing w:after="0"/>
+            </w:pPr>
+            <w:r>
+              <w:rPr>
+                <w:b w:val="false"/>
+                <w:bCs w:val="false"/>
+                <w:color w:val="000000"/>
+                <w:sz w:val="19"/>
+                <w:szCs w:val="19"/>
+              </w:rPr>
+              <w:t xml:space="preserve"/>
+            </w:r>
+          </w:p>
+          <w:p>
+            <w:pPr>
+              <w:spacing w:after="0"/>
+            </w:pPr>
+            <w:r>
+              <w:rPr>
+                <w:b w:val="false"/>
+                <w:bCs w:val="false"/>
+                <w:color w:val="000000"/>
+                <w:sz w:val="19"/>
+                <w:szCs w:val="19"/>
+              </w:rPr>
+              <w:t xml:space="preserve">Per kolom cascade, of anonimiseren?</w:t>
             </w:r>
           </w:p>
         </w:tc>
@@ -1306,7 +1244,7 @@
                 <w:sz w:val="19"/>
                 <w:szCs w:val="19"/>
               </w:rPr>
-              <w:t xml:space="preserve">Nu wel. goal_events_select geeft groepsgenoten leestoegang op deadline_moved, scope_reduced en milestone_dropped. Dat zijn per definitie tegenslagsignalen over iemand anders.</w:t>
+              <w:t xml:space="preserve">Nog steeds open, en het is een AVG-verplichting. Een account verwijderen faalt nu volledig. Vijf kolommen verwijzen naar profiles zonder cascade.</w:t>
             </w:r>
           </w:p>
           <w:p>
@@ -1336,37 +1274,7 @@
                 <w:sz w:val="19"/>
                 <w:szCs w:val="19"/>
               </w:rPr>
-              <w:t xml:space="preserve">Het beslisdocument (001-datamodel.md §4.2) staat het toe; domeinregel 7 in CLAUDE.md verbiedt het. Die twee spreken elkaar tegen en één moet wijken.</w:t>
-            </w:r>
-          </w:p>
-          <w:p>
-            <w:pPr>
-              <w:spacing w:after="0"/>
-            </w:pPr>
-            <w:r>
-              <w:rPr>
-                <w:b w:val="false"/>
-                <w:bCs w:val="false"/>
-                <w:color w:val="000000"/>
-                <w:sz w:val="19"/>
-                <w:szCs w:val="19"/>
-              </w:rPr>
-              <w:t xml:space="preserve"/>
-            </w:r>
-          </w:p>
-          <w:p>
-            <w:pPr>
-              <w:spacing w:after="0"/>
-            </w:pPr>
-            <w:r>
-              <w:rPr>
-                <w:b w:val="false"/>
-                <w:bCs w:val="false"/>
-                <w:color w:val="000000"/>
-                <w:sz w:val="19"/>
-                <w:szCs w:val="19"/>
-              </w:rPr>
-              <w:t xml:space="preserve">Mijn advies: domeinregel 7 laten winnen. Maar dit is jouw product, dus ik heb het niet zelf beslist.</w:t>
+              <w:t xml:space="preserve">Mijn advies: cascade voor je eigen data, maar anonimiseren bij goedkeuringen — een goedkeuring is bewijs voor iemand ánders en mag niet verdwijnen als de goedkeurder vertrekt. Dat is een productbeslissing, geen technische.</w:t>
             </w:r>
           </w:p>
         </w:tc>
@@ -1392,7 +1300,7 @@
                 <w:sz w:val="19"/>
                 <w:szCs w:val="19"/>
               </w:rPr>
-              <w:t xml:space="preserve">EPIC 2 en 12</w:t>
+              <w:t xml:space="preserve">AVG</w:t>
             </w:r>
           </w:p>
         </w:tc>
@@ -1420,7 +1328,7 @@
                 <w:sz w:val="19"/>
                 <w:szCs w:val="19"/>
               </w:rPr>
-              <w:t xml:space="preserve">A8</w:t>
+              <w:t xml:space="preserve">A7</w:t>
             </w:r>
           </w:p>
         </w:tc>
@@ -1446,7 +1354,7 @@
                 <w:sz w:val="19"/>
                 <w:szCs w:val="19"/>
               </w:rPr>
-              <w:t xml:space="preserve">Migratie: rate limiting op join_group_with_code en op uitnodigingen.</w:t>
+              <w:t xml:space="preserve">Productbeslissing: mag de groep zien dat jij je deadline verschoven hebt?</w:t>
             </w:r>
           </w:p>
         </w:tc>
@@ -1472,7 +1380,7 @@
                 <w:sz w:val="19"/>
                 <w:szCs w:val="19"/>
               </w:rPr>
-              <w:t xml:space="preserve">CLAUDE.md beveiligingsregel 5 eist een limiet per gebruiker per dag. De tabel invite_events bestaat al, mét de index die er precies voor gebouwd is — maar geen enkele regel code schrijft of leest hem.</w:t>
+              <w:t xml:space="preserve">Nog steeds open. goal_events geeft groepsgenoten nu leestoegang op deadline_moved, scope_reduced en milestone_dropped. Dat zijn per definitie tegenslagsignalen over iemand anders.</w:t>
             </w:r>
           </w:p>
           <w:p>
@@ -1502,7 +1410,113 @@
                 <w:sz w:val="19"/>
                 <w:szCs w:val="19"/>
               </w:rPr>
-              <w:t xml:space="preserve">Hoe erg brute-force wordt hangt af van het formaat van de uitnodigingscode, en dat is nog niet geschreven. Dat maakt dit juist het moment om het goed te doen.</w:t>
+              <w:t xml:space="preserve">Het beslisdocument staat het toe, domeinregel 7 verbiedt het. Die twee spreken elkaar tegen en één moet wijken. Ik zou domeinregel 7 laten winnen, maar dit is jouw product.</w:t>
+            </w:r>
+          </w:p>
+        </w:tc>
+        <w:tc>
+          <w:tcPr>
+            <w:tcW w:type="dxa" w:w="1700"/>
+            <w:tcMar>
+              <w:top w:type="dxa" w:w="80"/>
+              <w:left w:type="dxa" w:w="110"/>
+              <w:bottom w:type="dxa" w:w="80"/>
+              <w:right w:type="dxa" w:w="110"/>
+            </w:tcMar>
+          </w:tcPr>
+          <w:p>
+            <w:pPr>
+              <w:spacing w:after="0"/>
+            </w:pPr>
+            <w:r>
+              <w:rPr>
+                <w:b w:val="false"/>
+                <w:bCs w:val="false"/>
+                <w:color w:val="000000"/>
+                <w:sz w:val="19"/>
+                <w:szCs w:val="19"/>
+              </w:rPr>
+              <w:t xml:space="preserve">EPIC 2 en 12</w:t>
+            </w:r>
+          </w:p>
+        </w:tc>
+      </w:tr>
+      <w:tr>
+        <w:tc>
+          <w:tcPr>
+            <w:tcW w:type="dxa" w:w="560"/>
+            <w:tcMar>
+              <w:top w:type="dxa" w:w="80"/>
+              <w:left w:type="dxa" w:w="110"/>
+              <w:bottom w:type="dxa" w:w="80"/>
+              <w:right w:type="dxa" w:w="110"/>
+            </w:tcMar>
+          </w:tcPr>
+          <w:p>
+            <w:pPr>
+              <w:spacing w:after="0"/>
+            </w:pPr>
+            <w:r>
+              <w:rPr>
+                <w:b w:val="false"/>
+                <w:bCs w:val="false"/>
+                <w:color w:val="000000"/>
+                <w:sz w:val="19"/>
+                <w:szCs w:val="19"/>
+              </w:rPr>
+              <w:t xml:space="preserve">A9</w:t>
+            </w:r>
+          </w:p>
+        </w:tc>
+        <w:tc>
+          <w:tcPr>
+            <w:tcW w:type="dxa" w:w="3100"/>
+            <w:tcMar>
+              <w:top w:type="dxa" w:w="80"/>
+              <w:left w:type="dxa" w:w="110"/>
+              <w:bottom w:type="dxa" w:w="80"/>
+              <w:right w:type="dxa" w:w="110"/>
+            </w:tcMar>
+          </w:tcPr>
+          <w:p>
+            <w:pPr>
+              <w:spacing w:after="0"/>
+            </w:pPr>
+            <w:r>
+              <w:rPr>
+                <w:b w:val="false"/>
+                <w:bCs w:val="false"/>
+                <w:color w:val="000000"/>
+                <w:sz w:val="19"/>
+                <w:szCs w:val="19"/>
+              </w:rPr>
+              <w:t xml:space="preserve">Lokale Supabase-stack inrichten (Docker + WSL2).</w:t>
+            </w:r>
+          </w:p>
+        </w:tc>
+        <w:tc>
+          <w:tcPr>
+            <w:tcW w:type="dxa" w:w="4000"/>
+            <w:tcMar>
+              <w:top w:type="dxa" w:w="80"/>
+              <w:left w:type="dxa" w:w="110"/>
+              <w:bottom w:type="dxa" w:w="80"/>
+              <w:right w:type="dxa" w:w="110"/>
+            </w:tcMar>
+          </w:tcPr>
+          <w:p>
+            <w:pPr>
+              <w:spacing w:after="0"/>
+            </w:pPr>
+            <w:r>
+              <w:rPr>
+                <w:b w:val="false"/>
+                <w:bCs w:val="false"/>
+                <w:color w:val="000000"/>
+                <w:sz w:val="19"/>
+                <w:szCs w:val="19"/>
+              </w:rPr>
+              <w:t xml:space="preserve">Je vroeg hierom, en het is niet gelukt: Docker Desktop vraagt beheerdersrechten, WSL2 staat niet geïnstalleerd, en beide vragen een herstart en het accepteren van een licentie. Dat kan ik geen van drieën.</w:t>
             </w:r>
           </w:p>
           <w:p>
@@ -1532,7 +1546,37 @@
                 <w:sz w:val="19"/>
                 <w:szCs w:val="19"/>
               </w:rPr>
-              <w:t xml:space="preserve">Daarnaast: er is geen enkele limiet op het aantal groepen per gebruiker of leden per groep. Eén account kan tienduizend groepen aanmaken op de gratis tier.</w:t>
+              <w:t xml:space="preserve">De Supabase CLI werkt wél — via npx, zonder installatie.</w:t>
+            </w:r>
+          </w:p>
+          <w:p>
+            <w:pPr>
+              <w:spacing w:after="0"/>
+            </w:pPr>
+            <w:r>
+              <w:rPr>
+                <w:b w:val="false"/>
+                <w:bCs w:val="false"/>
+                <w:color w:val="000000"/>
+                <w:sz w:val="19"/>
+                <w:szCs w:val="19"/>
+              </w:rPr>
+              <w:t xml:space="preserve"/>
+            </w:r>
+          </w:p>
+          <w:p>
+            <w:pPr>
+              <w:spacing w:after="0"/>
+            </w:pPr>
+            <w:r>
+              <w:rPr>
+                <w:b w:val="false"/>
+                <w:bCs w:val="false"/>
+                <w:color w:val="000000"/>
+                <w:sz w:val="19"/>
+                <w:szCs w:val="19"/>
+              </w:rPr>
+              <w:t xml:space="preserve">Zolang er geen lokale stack is, draait elke migratie rechtstreeks op het echte project. Dat ging nu goed omdat het leeg was. Zodra jij of een testgebruiker de app opent, is dat niet meer waar.</w:t>
             </w:r>
           </w:p>
         </w:tc>
@@ -1558,7 +1602,143 @@
                 <w:sz w:val="19"/>
                 <w:szCs w:val="19"/>
               </w:rPr>
-              <w:t xml:space="preserve">EPIC 5</w:t>
+              <w:t xml:space="preserve">elke migratie</w:t>
+            </w:r>
+          </w:p>
+        </w:tc>
+      </w:tr>
+      <w:tr>
+        <w:tc>
+          <w:tcPr>
+            <w:tcW w:type="dxa" w:w="560"/>
+            <w:tcMar>
+              <w:top w:type="dxa" w:w="80"/>
+              <w:left w:type="dxa" w:w="110"/>
+              <w:bottom w:type="dxa" w:w="80"/>
+              <w:right w:type="dxa" w:w="110"/>
+            </w:tcMar>
+          </w:tcPr>
+          <w:p>
+            <w:pPr>
+              <w:spacing w:after="0"/>
+            </w:pPr>
+            <w:r>
+              <w:rPr>
+                <w:b w:val="false"/>
+                <w:bCs w:val="false"/>
+                <w:color w:val="000000"/>
+                <w:sz w:val="19"/>
+                <w:szCs w:val="19"/>
+              </w:rPr>
+              <w:t xml:space="preserve">A10</w:t>
+            </w:r>
+          </w:p>
+        </w:tc>
+        <w:tc>
+          <w:tcPr>
+            <w:tcW w:type="dxa" w:w="3100"/>
+            <w:tcMar>
+              <w:top w:type="dxa" w:w="80"/>
+              <w:left w:type="dxa" w:w="110"/>
+              <w:bottom w:type="dxa" w:w="80"/>
+              <w:right w:type="dxa" w:w="110"/>
+            </w:tcMar>
+          </w:tcPr>
+          <w:p>
+            <w:pPr>
+              <w:spacing w:after="0"/>
+            </w:pPr>
+            <w:r>
+              <w:rPr>
+                <w:b w:val="false"/>
+                <w:bCs w:val="false"/>
+                <w:color w:val="000000"/>
+                <w:sz w:val="19"/>
+                <w:szCs w:val="19"/>
+              </w:rPr>
+              <w:t xml:space="preserve">Zet "leaked password protection" aan in Supabase Auth.</w:t>
+            </w:r>
+          </w:p>
+        </w:tc>
+        <w:tc>
+          <w:tcPr>
+            <w:tcW w:type="dxa" w:w="4000"/>
+            <w:tcMar>
+              <w:top w:type="dxa" w:w="80"/>
+              <w:left w:type="dxa" w:w="110"/>
+              <w:bottom w:type="dxa" w:w="80"/>
+              <w:right w:type="dxa" w:w="110"/>
+            </w:tcMar>
+          </w:tcPr>
+          <w:p>
+            <w:pPr>
+              <w:spacing w:after="0"/>
+            </w:pPr>
+            <w:r>
+              <w:rPr>
+                <w:b w:val="false"/>
+                <w:bCs w:val="false"/>
+                <w:color w:val="000000"/>
+                <w:sz w:val="19"/>
+                <w:szCs w:val="19"/>
+              </w:rPr>
+              <w:t xml:space="preserve">Staat nu uit. Supabase kan wachtwoorden controleren tegen HaveIBeenPwned. Ik eis twaalf tekens en geen tekenklassen (lengte is sterker dan samenstelling), maar dat houdt een lang en tóch gelekt wachtwoord niet tegen.</w:t>
+            </w:r>
+          </w:p>
+          <w:p>
+            <w:pPr>
+              <w:spacing w:after="0"/>
+            </w:pPr>
+            <w:r>
+              <w:rPr>
+                <w:b w:val="false"/>
+                <w:bCs w:val="false"/>
+                <w:color w:val="000000"/>
+                <w:sz w:val="19"/>
+                <w:szCs w:val="19"/>
+              </w:rPr>
+              <w:t xml:space="preserve"/>
+            </w:r>
+          </w:p>
+          <w:p>
+            <w:pPr>
+              <w:spacing w:after="0"/>
+            </w:pPr>
+            <w:r>
+              <w:rPr>
+                <w:b w:val="false"/>
+                <w:bCs w:val="false"/>
+                <w:color w:val="000000"/>
+                <w:sz w:val="19"/>
+                <w:szCs w:val="19"/>
+              </w:rPr>
+              <w:t xml:space="preserve">Eén schakelaar in het dashboard, onder Authentication → Policies.</w:t>
+            </w:r>
+          </w:p>
+        </w:tc>
+        <w:tc>
+          <w:tcPr>
+            <w:tcW w:type="dxa" w:w="1700"/>
+            <w:tcMar>
+              <w:top w:type="dxa" w:w="80"/>
+              <w:left w:type="dxa" w:w="110"/>
+              <w:bottom w:type="dxa" w:w="80"/>
+              <w:right w:type="dxa" w:w="110"/>
+            </w:tcMar>
+          </w:tcPr>
+          <w:p>
+            <w:pPr>
+              <w:spacing w:after="0"/>
+            </w:pPr>
+            <w:r>
+              <w:rPr>
+                <w:b w:val="false"/>
+                <w:bCs w:val="false"/>
+                <w:color w:val="000000"/>
+                <w:sz w:val="19"/>
+                <w:szCs w:val="19"/>
+              </w:rPr>
+              <w:t xml:space="preserve">QS8-25</w:t>
             </w:r>
           </w:p>
         </w:tc>

</xml_diff>

<commit_message>
Q to-do afgerond: A9 is een besluit geworden, A11 en A12 erbij
A9 (lokale stack) staat nu als bewust uitgesteld, met de deadline erbij: de
eerste echte gebruiker. Ook waarom een tweede Supabase-project geen alternatief
is — het free-plan staat twee actieve projecten toe en die zijn bezet.

A11: de rollover-functie werkt maar wordt door niets aangeroepen. Zonder planning
gebeurt er bij een cyclusovergang niets.

A12: er is geen Storage-bucket en geen policy, terwijl attachment_url al in twee
tabellen staat. Nu ongevaarlijk, op de dag van de eerste upload niet meer.

Co-Authored-By: Claude Opus 5 <noreply@anthropic.com>
</commit_message>
<xml_diff>
--- a/docs/Q-TODO.docx
+++ b/docs/Q-TODO.docx
@@ -45,7 +45,7 @@
           <w:sz w:val="21"/>
           <w:szCs w:val="21"/>
         </w:rPr>
-        <w:t xml:space="preserve">Bijgewerkt: 16-08-2026, na de bouwsessie.</w:t>
+        <w:t xml:space="preserve">Bijgewerkt: 16-08-2026, aan het eind van de bouwsessie.</w:t>
       </w:r>
     </w:p>
     <w:p>
@@ -1464,6 +1464,218 @@
                 <w:sz w:val="19"/>
                 <w:szCs w:val="19"/>
               </w:rPr>
+              <w:t xml:space="preserve">A11</w:t>
+            </w:r>
+          </w:p>
+        </w:tc>
+        <w:tc>
+          <w:tcPr>
+            <w:tcW w:type="dxa" w:w="3100"/>
+            <w:tcMar>
+              <w:top w:type="dxa" w:w="80"/>
+              <w:left w:type="dxa" w:w="110"/>
+              <w:bottom w:type="dxa" w:w="80"/>
+              <w:right w:type="dxa" w:w="110"/>
+            </w:tcMar>
+          </w:tcPr>
+          <w:p>
+            <w:pPr>
+              <w:spacing w:after="0"/>
+            </w:pPr>
+            <w:r>
+              <w:rPr>
+                <w:b w:val="false"/>
+                <w:bCs w:val="false"/>
+                <w:color w:val="000000"/>
+                <w:sz w:val="19"/>
+                <w:szCs w:val="19"/>
+              </w:rPr>
+              <w:t xml:space="preserve">Plan de rollover-job in.</w:t>
+            </w:r>
+          </w:p>
+        </w:tc>
+        <w:tc>
+          <w:tcPr>
+            <w:tcW w:type="dxa" w:w="4000"/>
+            <w:tcMar>
+              <w:top w:type="dxa" w:w="80"/>
+              <w:left w:type="dxa" w:w="110"/>
+              <w:bottom w:type="dxa" w:w="80"/>
+              <w:right w:type="dxa" w:w="110"/>
+            </w:tcMar>
+          </w:tcPr>
+          <w:p>
+            <w:pPr>
+              <w:spacing w:after="0"/>
+            </w:pPr>
+            <w:r>
+              <w:rPr>
+                <w:b w:val="false"/>
+                <w:bCs w:val="false"/>
+                <w:color w:val="000000"/>
+                <w:sz w:val="19"/>
+                <w:szCs w:val="19"/>
+              </w:rPr>
+              <w:t xml:space="preserve">De Edge Function "rollover" is gedeployd en getest, maar wordt door niets aangeroepen. Zolang dat zo is gebeurt er bij een cyclusovergang niets: geen minpunten, geen gemiste weken, geen reeks die breekt.\n\nInplannen kan via Supabase Cron in het dashboard (eenvoudigst), of via pg_cron met pg_net. Dat laatste vraagt de service-role-key in de database via Vault — een beslissing die ik niet stilzwijgend voor je neem.\n\nHandmatig aanroepen kan met een POST op /functions/v1/rollover met de service-role-key als Bearer-token.</w:t>
+            </w:r>
+          </w:p>
+        </w:tc>
+        <w:tc>
+          <w:tcPr>
+            <w:tcW w:type="dxa" w:w="1700"/>
+            <w:tcMar>
+              <w:top w:type="dxa" w:w="80"/>
+              <w:left w:type="dxa" w:w="110"/>
+              <w:bottom w:type="dxa" w:w="80"/>
+              <w:right w:type="dxa" w:w="110"/>
+            </w:tcMar>
+          </w:tcPr>
+          <w:p>
+            <w:pPr>
+              <w:spacing w:after="0"/>
+            </w:pPr>
+            <w:r>
+              <w:rPr>
+                <w:b w:val="false"/>
+                <w:bCs w:val="false"/>
+                <w:color w:val="000000"/>
+                <w:sz w:val="19"/>
+                <w:szCs w:val="19"/>
+              </w:rPr>
+              <w:t xml:space="preserve">EPIC 4 werkend krijgen</w:t>
+            </w:r>
+          </w:p>
+        </w:tc>
+      </w:tr>
+      <w:tr>
+        <w:tc>
+          <w:tcPr>
+            <w:tcW w:type="dxa" w:w="560"/>
+            <w:tcMar>
+              <w:top w:type="dxa" w:w="80"/>
+              <w:left w:type="dxa" w:w="110"/>
+              <w:bottom w:type="dxa" w:w="80"/>
+              <w:right w:type="dxa" w:w="110"/>
+            </w:tcMar>
+          </w:tcPr>
+          <w:p>
+            <w:pPr>
+              <w:spacing w:after="0"/>
+            </w:pPr>
+            <w:r>
+              <w:rPr>
+                <w:b w:val="false"/>
+                <w:bCs w:val="false"/>
+                <w:color w:val="000000"/>
+                <w:sz w:val="19"/>
+                <w:szCs w:val="19"/>
+              </w:rPr>
+              <w:t xml:space="preserve">A12</w:t>
+            </w:r>
+          </w:p>
+        </w:tc>
+        <w:tc>
+          <w:tcPr>
+            <w:tcW w:type="dxa" w:w="3100"/>
+            <w:tcMar>
+              <w:top w:type="dxa" w:w="80"/>
+              <w:left w:type="dxa" w:w="110"/>
+              <w:bottom w:type="dxa" w:w="80"/>
+              <w:right w:type="dxa" w:w="110"/>
+            </w:tcMar>
+          </w:tcPr>
+          <w:p>
+            <w:pPr>
+              <w:spacing w:after="0"/>
+            </w:pPr>
+            <w:r>
+              <w:rPr>
+                <w:b w:val="false"/>
+                <w:bCs w:val="false"/>
+                <w:color w:val="000000"/>
+                <w:sz w:val="19"/>
+                <w:szCs w:val="19"/>
+              </w:rPr>
+              <w:t xml:space="preserve">Maak een Storage-bucket aan, met policies.</w:t>
+            </w:r>
+          </w:p>
+        </w:tc>
+        <w:tc>
+          <w:tcPr>
+            <w:tcW w:type="dxa" w:w="4000"/>
+            <w:tcMar>
+              <w:top w:type="dxa" w:w="80"/>
+              <w:left w:type="dxa" w:w="110"/>
+              <w:bottom w:type="dxa" w:w="80"/>
+              <w:right w:type="dxa" w:w="110"/>
+            </w:tcMar>
+          </w:tcPr>
+          <w:p>
+            <w:pPr>
+              <w:spacing w:after="0"/>
+            </w:pPr>
+            <w:r>
+              <w:rPr>
+                <w:b w:val="false"/>
+                <w:bCs w:val="false"/>
+                <w:color w:val="000000"/>
+                <w:sz w:val="19"/>
+                <w:szCs w:val="19"/>
+              </w:rPr>
+              <w:t xml:space="preserve">Er is geen bucket en geen storage.objects-policy, terwijl completions.attachment_url en chat_messages.attachment_url al in het schema staan.\n\nNu niet gevaarlijk omdat er niets geüpload wordt. Op de dag dat de eerste upload gebouwd wordt is het een open bucket tenzij iemand eraan denkt — en dat is precies het soort ding waar niemand aan denkt.\n\nBlokkeert avatar-upload (QS8-27) en foto\u2019s in de chat (QS8-71).</w:t>
+            </w:r>
+          </w:p>
+        </w:tc>
+        <w:tc>
+          <w:tcPr>
+            <w:tcW w:type="dxa" w:w="1700"/>
+            <w:tcMar>
+              <w:top w:type="dxa" w:w="80"/>
+              <w:left w:type="dxa" w:w="110"/>
+              <w:bottom w:type="dxa" w:w="80"/>
+              <w:right w:type="dxa" w:w="110"/>
+            </w:tcMar>
+          </w:tcPr>
+          <w:p>
+            <w:pPr>
+              <w:spacing w:after="0"/>
+            </w:pPr>
+            <w:r>
+              <w:rPr>
+                <w:b w:val="false"/>
+                <w:bCs w:val="false"/>
+                <w:color w:val="000000"/>
+                <w:sz w:val="19"/>
+                <w:szCs w:val="19"/>
+              </w:rPr>
+              <w:t xml:space="preserve">QS8-27, EPIC 7</w:t>
+            </w:r>
+          </w:p>
+        </w:tc>
+      </w:tr>
+      <w:tr>
+        <w:tc>
+          <w:tcPr>
+            <w:tcW w:type="dxa" w:w="560"/>
+            <w:tcMar>
+              <w:top w:type="dxa" w:w="80"/>
+              <w:left w:type="dxa" w:w="110"/>
+              <w:bottom w:type="dxa" w:w="80"/>
+              <w:right w:type="dxa" w:w="110"/>
+            </w:tcMar>
+          </w:tcPr>
+          <w:p>
+            <w:pPr>
+              <w:spacing w:after="0"/>
+            </w:pPr>
+            <w:r>
+              <w:rPr>
+                <w:b w:val="false"/>
+                <w:bCs w:val="false"/>
+                <w:color w:val="000000"/>
+                <w:sz w:val="19"/>
+                <w:szCs w:val="19"/>
+              </w:rPr>
               <w:t xml:space="preserve">A9</w:t>
             </w:r>
           </w:p>
@@ -1490,7 +1702,7 @@
                 <w:sz w:val="19"/>
                 <w:szCs w:val="19"/>
               </w:rPr>
-              <w:t xml:space="preserve">Lokale Supabase-stack inrichten (Docker + WSL2).</w:t>
+              <w:t xml:space="preserve">Lokale Supabase-stack inrichten (Docker + WSL2). UITGESTELD op jouw verzoek.</w:t>
             </w:r>
           </w:p>
         </w:tc>
@@ -1516,67 +1728,7 @@
                 <w:sz w:val="19"/>
                 <w:szCs w:val="19"/>
               </w:rPr>
-              <w:t xml:space="preserve">Je vroeg hierom, en het is niet gelukt: Docker Desktop vraagt beheerdersrechten, WSL2 staat niet geïnstalleerd, en beide vragen een herstart en het accepteren van een licentie. Dat kan ik geen van drieën.</w:t>
-            </w:r>
-          </w:p>
-          <w:p>
-            <w:pPr>
-              <w:spacing w:after="0"/>
-            </w:pPr>
-            <w:r>
-              <w:rPr>
-                <w:b w:val="false"/>
-                <w:bCs w:val="false"/>
-                <w:color w:val="000000"/>
-                <w:sz w:val="19"/>
-                <w:szCs w:val="19"/>
-              </w:rPr>
-              <w:t xml:space="preserve"/>
-            </w:r>
-          </w:p>
-          <w:p>
-            <w:pPr>
-              <w:spacing w:after="0"/>
-            </w:pPr>
-            <w:r>
-              <w:rPr>
-                <w:b w:val="false"/>
-                <w:bCs w:val="false"/>
-                <w:color w:val="000000"/>
-                <w:sz w:val="19"/>
-                <w:szCs w:val="19"/>
-              </w:rPr>
-              <w:t xml:space="preserve">De Supabase CLI werkt wél — via npx, zonder installatie.</w:t>
-            </w:r>
-          </w:p>
-          <w:p>
-            <w:pPr>
-              <w:spacing w:after="0"/>
-            </w:pPr>
-            <w:r>
-              <w:rPr>
-                <w:b w:val="false"/>
-                <w:bCs w:val="false"/>
-                <w:color w:val="000000"/>
-                <w:sz w:val="19"/>
-                <w:szCs w:val="19"/>
-              </w:rPr>
-              <w:t xml:space="preserve"/>
-            </w:r>
-          </w:p>
-          <w:p>
-            <w:pPr>
-              <w:spacing w:after="0"/>
-            </w:pPr>
-            <w:r>
-              <w:rPr>
-                <w:b w:val="false"/>
-                <w:bCs w:val="false"/>
-                <w:color w:val="000000"/>
-                <w:sz w:val="19"/>
-                <w:szCs w:val="19"/>
-              </w:rPr>
-              <w:t xml:space="preserve">Zolang er geen lokale stack is, draait elke migratie rechtstreeks op het echte project. Dat ging nu goed omdat het leeg was. Zodra jij of een testgebruiker de app opent, is dat niet meer waar.</w:t>
+              <w:t xml:space="preserve">Je hebt besloten dit later te doen, en dat is verdedigbaar: er komen geen gebruikers voordat alle fases geprogrammeerd zijn, dus een verkeerde migratie is nu simpelweg opnieuw te doen.\n\nWat het je straks oplevert: een repetitie voor elke migratie, "supabase db reset" voor een schone database uit 0001 tot en met N, en de RLS-tests uit je productieproject. Die maken nu bij elke testrun echte accounts aan in het echte project.\n\nDrie commando\u2019s met twee herstarts: wsl --install, winget install Docker.DockerDesktop, winget install PostgreSQL.PostgreSQL.17. Die laatste levert pg_dump en haalt daarmee ook C4 weg.\n\nDEADLINE: de eerste echte gebruiker die zich aanmeldt. Vanaf dat moment is direct migreren op productie niet meer verdedigbaar, want de gratis tier heeft geen backups.\n\nEen tweede Supabase-project als dev-database is g\u00e9\u00e9n alternatief: je organisatie zit op het free-plan, dat staat twee actieve projecten toe, en die zijn bezet door goalbuddies en de Status Tracker.</w:t>
             </w:r>
           </w:p>
         </w:tc>
@@ -1602,7 +1754,7 @@
                 <w:sz w:val="19"/>
                 <w:szCs w:val="19"/>
               </w:rPr>
-              <w:t xml:space="preserve">elke migratie</w:t>
+              <w:t xml:space="preserve">straks alles</w:t>
             </w:r>
           </w:p>
         </w:tc>

</xml_diff>

<commit_message>
Q-TODO en werkvoorraad: A31 en de reviewbevindingen
A31 is een gat dat ik zelf gemaakt heb en dat opgeschreven hoort te staan: door
goals.status dicht te zetten is er nu geen enkel pad meer naar 'completed'.
Niets zette hem behalve de client, en dat was precies het lek. Wanneer een doel
af is, is een productbeslissing.

Co-Authored-By: Claude Opus 5 <noreply@anthropic.com>
</commit_message>
<xml_diff>
--- a/docs/Q-TODO.docx
+++ b/docs/Q-TODO.docx
@@ -36,7 +36,7 @@
         <w:spacing w:after="240"/>
       </w:pPr>
       <w:r>
-        <w:t>Bijgewerkt: 18-08-2026, na de besluitenronde. Je antwoorden op A3, A7, A15, A17, A18 en A19 zijn uitgevoerd in migraties 0029 t/m 0033; die rijen staan hieronder afgevinkt. Nieuw en nog open: sectie E, met A27 tot en met A30. C2 is ingevuld, dus EPIC 3 is niet meer geblokkeerd op de sleutel.</w:t>
+        <w:t>Bijgewerkt: 18-08-2026, na de besluitenronde én de reviewronde daarop. Je antwoorden op A3, A7, A15, A17, A18 en A19 zijn uitgevoerd in migraties 0029 t/m 0035; die rijen staan hieronder afgevinkt. Nieuw en nog open: sectie E, met A27 tot en met A31. C2 is ingevuld, dus EPIC 3 is niet meer geblokkeerd op de sleutel.</w:t>
       </w:r>
     </w:p>
     <w:p>
@@ -4576,6 +4576,44 @@
     <w:p>
       <w:r>
         <w:t>ANTHROPIC_API_KEY staat ingevuld. EPIC 3 (de Doelcoach) is daarmee niet meer op de sleutel geblokkeerd; wat er nog wél ligt is B3, de keuze tussen de SDK en rechtstreeks fetch vanuit de Edge Function.</w:t>
+      </w:r>
+    </w:p>
+    <w:p>
+      <w:r>
+        <w:rPr>
+          <w:b/>
+        </w:rPr>
+        <w:t>A31 — Wanneer is een doel "afgerond"? Nu kan het niet meer.</w:t>
+      </w:r>
+    </w:p>
+    <w:p>
+      <w:r>
+        <w:t>Dit is een gat dat ik zelf gemaakt heb en dat je moet weten. De security-review vond dat goals.status wagenwijd openstond: met een PATCH kon je je eigen doel op "completed" zetten, waarna er in elke gekoppelde groep "X heeft een doel afgerond" verscheen zonder dat er iets was afgerond. Dat is dichtgezet (migratie 0035): archiveren loopt nu via een RPC die alleen "active" en "archived" toestaat.</w:t>
+        <w:br/>
+        <w:br/>
+        <w:t>Gevolg: er is nu géén pad meer naar "completed". Ik heb nagekeken of een trigger het zet als alle mijlpalen af zijn — dat doet niets; meld_doel_af() reageert er alleen op. Vóór 0035 was het enige pad de client, en dat was precies het probleem. Nu kan alleen service_role het.</w:t>
+        <w:br/>
+        <w:br/>
+        <w:t>De vraag eronder is een productbeslissing en daarom niet door mij ingevuld: wannéér is een doel af? Als alle mijlpalen "done" zijn? Als de eigenaar het zegt? Of moet een buddy het bevestigen, zoals bij een weekdoel? Zeg wat je wilt, dan bouw ik het als trigger of RPC. Tot die tijd is "doel afgerond" onbereikbaar — geen storing, wel een ontbrekende feature. Hoort waarschijnlijk bij EPIC 2 of EPIC 8.</w:t>
+      </w:r>
+    </w:p>
+    <w:p>
+      <w:r>
+        <w:rPr>
+          <w:b/>
+        </w:rPr>
+        <w:t>Ter kennisgeving — de reviewronde vond negen dingen, en drie waren blokkerend.</w:t>
+      </w:r>
+    </w:p>
+    <w:p>
+      <w:r>
+        <w:t>De zwaarste: je account verwijderen wiste het werk van je buddy’s. Migratie 0031 redeneerde netjes door voor goedkeuringen en chatberichten ("wat bewijs is voor iemand anders blijft staan zonder jouw naam") en paste diezelfde eis niet toe op de weekafsluiting. week_reviews cascadeerde, en week_review_replies cascadeert daar weer op — dus de reacties die twee andere mensen onder jouw weekafsluiting schreven, verdwenen mee. Geen misbruik nodig, gewoon het bestaande pad. Gerepareerd in 0035, met een test.</w:t>
+        <w:br/>
+        <w:br/>
+        <w:t>De pijnlijkste: het slot dat in CLAUDE.md staat is één keer niet dichtgevallen. Migratie 0032 zette een negende systeembericht op de allowlist in de database en de kopie in de app bleef op acht staan — met een groene test, want die vergeleek de oude lijst met zichzelf. Twee insluitingen zijn geen gelijkheid. Er is nu één test die de twee verzamelingen gelijkstelt.</w:t>
+        <w:br/>
+        <w:br/>
+        <w:t>De derde: een uitgezet lid kon nog een goedkeuring intrekken en daarmee de week van een ánder terugklappen naar pending, inclusief het terugboeken van diens punten.</w:t>
       </w:r>
     </w:p>
     <w:sectPr>

</xml_diff>

<commit_message>
Valkuil 19: een winget-installatie is niet zichtbaar in een oud proces
Gevonden bij gh, en dezelfde avond bij de Supabase CLI en pg_dump. Een
Windows-proces krijgt zijn omgeving mee bij het starten en ververst die nooit;
een nieuw tabblad erft de omgeving van het moederproces, dus een nieuw venster
openen lost het niet betrouwbaar op. Met de drie uitwegen erbij en de controle
die je eerst doet, zodat niemand nog eens gaat herinstalleren.

C3, C4 en C6 in de Q-to-do afgevinkt: Supabase CLI, pg_dump en gh staan er nu.
Branch protection (C5) kan daarmee via gh api in plaats van de webinterface.

Co-Authored-By: Claude Opus 5 <noreply@anthropic.com>
</commit_message>
<xml_diff>
--- a/docs/Q-TODO.docx
+++ b/docs/Q-TODO.docx
@@ -3568,11 +3568,9 @@
           <w:p>
             <w:r>
               <w:rPr>
-                <w:color w:val="000000"/>
-                <w:sz w:val="19"/>
-                <w:szCs w:val="19"/>
-              </w:rPr>
-              <w:t>weg</w:t>
+                <w:b/>
+              </w:rPr>
+              <w:t>✅ gedaan 18-08 — Supabase CLI staat er</w:t>
             </w:r>
           </w:p>
         </w:tc>
@@ -3660,11 +3658,9 @@
           <w:p>
             <w:r>
               <w:rPr>
-                <w:color w:val="000000"/>
-                <w:sz w:val="19"/>
-                <w:szCs w:val="19"/>
-              </w:rPr>
-              <w:t>weg</w:t>
+                <w:b/>
+              </w:rPr>
+              <w:t>✅ gedaan 18-08 — pg_dump staat er</w:t>
             </w:r>
           </w:p>
         </w:tc>
@@ -3844,11 +3840,9 @@
           <w:p>
             <w:r>
               <w:rPr>
-                <w:color w:val="000000"/>
-                <w:sz w:val="19"/>
-                <w:szCs w:val="19"/>
-              </w:rPr>
-              <w:t>Proces</w:t>
+                <w:b/>
+              </w:rPr>
+              <w:t>✅ gedaan 18-08 — gh 2.97.0, ingelogd als QS86-bot</w:t>
             </w:r>
           </w:p>
         </w:tc>

</xml_diff>

<commit_message>
A13 afgevinkt: rollover opnieuw gedeployd en geverifieerd
Stond als geblokkeerd genoteerd omdat 'de CLI een access token vraagt dat een
sessie niet heeft'. Dat klopte niet: het token staat in de CLI-config, niet in
.env, en supabase projects list werkte gewoon. Eerst controleren of iets echt
geblokkeerd is voordat je het als blokkade opschrijft.

A11 blijft open — de functie draait nog steeds door niets aangeroepen.

Co-Authored-By: Claude Opus 5 <noreply@anthropic.com>
</commit_message>
<xml_diff>
--- a/docs/Q-TODO.docx
+++ b/docs/Q-TODO.docx
@@ -2249,11 +2249,9 @@
           <w:p>
             <w:r>
               <w:rPr>
-                <w:color w:val="000000"/>
-                <w:sz w:val="19"/>
-                <w:szCs w:val="19"/>
-              </w:rPr>
-              <w:t>A11, EPIC 5 en EPIC 4</w:t>
+                <w:b/>
+              </w:rPr>
+              <w:t>✅ gedaan 19-08 — opnieuw gedeployd en geverifieerd</w:t>
             </w:r>
           </w:p>
         </w:tc>

</xml_diff>

<commit_message>
A11: rollover-planning gebouwd, wacht op een push naar main
Een geplande GitHub-workflow draait uitsluitend vanaf de default branch. De
commit staat nu op de De Ketting-branch, dus tot die gemerged en gepusht is
gebeurt er nog niets.

Co-Authored-By: Claude Opus 5 <noreply@anthropic.com>
</commit_message>
<xml_diff>
--- a/docs/Q-TODO.docx
+++ b/docs/Q-TODO.docx
@@ -1255,11 +1255,9 @@
           <w:p>
             <w:r>
               <w:rPr>
-                <w:color w:val="000000"/>
-                <w:sz w:val="19"/>
-                <w:szCs w:val="19"/>
-              </w:rPr>
-              <w:t>EPIC 4 werkend krijgen</w:t>
+                <w:b/>
+              </w:rPr>
+              <w:t>⏳ gebouwd 19-08 — GitHub Actions, elk uur. Draait pas als de workflow op main staat én gepusht is</w:t>
             </w:r>
           </w:p>
         </w:tc>

</xml_diff>

<commit_message>
Overdracht bijgewerkt na de backlogronde
EPIC 8 is af voor de MVP. Zes issues afgerond, drie migraties toegepast,
476 tests groen over 25 bestanden zonder skips.

De belangrijkste regel in de overdracht is de waarschuwing bij EPIC 12:
goals.risk_status is via goals_select leesbaar voor groepsgenoten en staat
vandaag bij iedereen op on_track. EPIC 12 is precies wat daar verandering in
brengt. Zelfde vorm als A45 met excused, en die kwam er deze week net op
tijd uit - dicht deze dus voor of tegelijk met QS8-93, niet erna.

Twee valkuilen erbij: een issue op Done betekent niet dat een mens erbij
kan, en een DEFERRABLE constraint vraagt een RPC omdat PostgREST je per
verzoek precies een transactie geeft.

Co-Authored-By: Claude Opus 5 <noreply@anthropic.com>
</commit_message>
<xml_diff>
--- a/docs/Q-TODO.docx
+++ b/docs/Q-TODO.docx
@@ -4959,6 +4959,86 @@
     <w:p>
       <w:r>
         <w:t xml:space="preserve">Het acceptatiecriterium van QS8-82 zegt dat een adempauze vooraf aangekondigd wordt aan de groep en zichtbaar blijft in het groepsoverzicht. Dat lijkt in strijd met wat A45 net dichtgezet heeft, en dat is het niet. Het datamodel maakt het onderscheid al: breathers_select laat groepsgenoten je adempauze wel zien, want dat is de aankondiging en die loopt via jou - precies de uitzondering die domeinregel 7 zelf benoemt. weekly_goals.status = 'excused' is iets anders: een afgeleid feit per week dat uitleesbaar is zonder dat iemand iets aankondigt. De groep ziet dus “Sanne heeft een adempauze van week X tot Y” en niet “Sanne heeft week 12, 19 en 26 niet gehaald”.</w:t>
+      </w:r>
+    </w:p>
+    <w:p>
+      <w:r>
+        <w:t xml:space="preserve">J. Uit de backlogronde - 20-08-2026</w:t>
+      </w:r>
+    </w:p>
+    <w:p>
+      <w:r>
+        <w:t xml:space="preserve">Afgerond in deze ronde: QS8-106, QS8-112, QS8-82, QS8-39, QS8-76 en QS8-85, plus A45. Migraties 0047, 0048 en 0049 staan op het echte project. 476 tests groen over 25 bestanden, geen skips. Hieronder staat wat er onderweg besloten of gevonden is en wat jouw aandacht vraagt.</w:t>
+      </w:r>
+    </w:p>
+    <w:p>
+      <w:r>
+        <w:t xml:space="preserve">A46 - Besluit: mag ik TRUNCATE en TRIGGER intrekken op alle tabellen?</w:t>
+      </w:r>
+    </w:p>
+    <w:p>
+      <w:r>
+        <w:t xml:space="preserve">Gevonden bij het intrekken van de schrijfrechten op breathers. De rol authenticated heeft TRUNCATE en TRIGGER op alle 28 tabellen. TRUNCATE is niet onderworpen aan RLS: een rol die het heeft, leegt de tabel ongeacht welke policy erop staat. Dat geldt dus ook voor points_ledger, completions en chat_messages.</w:t>
+      </w:r>
+    </w:p>
+    <w:p>
+      <w:r>
+        <w:t xml:space="preserve">Vandaag is het niet bereikbaar. PostgREST doet alleen SELECT, INSERT, UPDATE, DELETE en RPC - geen DDL en geen TRUNCATE. Het is een deur zonder slot in een muur waar nu geen gang achter zit. Dat verandert zodra iemand met de rol authenticated een directe verbinding krijgt, of zodra er ooit een SECURITY INVOKER-functie komt die dynamische SQL uitvoert.</w:t>
+      </w:r>
+    </w:p>
+    <w:p>
+      <w:r>
+        <w:t xml:space="preserve">Het is vrijwel zeker een Supabase-standaard (grant all on all tables) en geen bewuste keuze, vergelijkbaar met de rij over migratie 0004 in ENGINEER-REVIEW. Reparatie is een revoke plus hetzelfde in de default privileges zodat nieuwe tabellen het niet opnieuw krijgen. Ik heb het niet gedaan omdat het de rechten van elke tabel tegelijk raakt en dat een auth-wijziging is. Kost vijf minuten als je ja zegt.</w:t>
+      </w:r>
+    </w:p>
+    <w:p>
+      <w:r>
+        <w:t xml:space="preserve">Ter kennisgeving - de adempauze is strenger dan QS8-82 letterlijk vraagt</w:t>
+      </w:r>
+    </w:p>
+    <w:p>
+      <w:r>
+        <w:t xml:space="preserve">De issue zegt “vooraf aangekondigd”. plan_adempauze() eist dat de adempauze begint in een cyclus die nog niet begonnen is. Zou de lopende cyclus ook mogen, dan is dit op zondagavond een gratis uitweg uit het minpunt: je weet dat je je week niet haalt, je kondigt een adempauze aan, en de rollover zet je weekdoel op excused in plaats van missed. Dat is dezelfde ontsnapping als A39 en A40, en die hebben samen vier migraties gekost.</w:t>
+      </w:r>
+    </w:p>
+    <w:p>
+      <w:r>
+        <w:t xml:space="preserve">Praktisch gevolg dat je moet weten: “ik ben nu ziek” kan niet met terugwerkende kracht. Je plant hem voor de week die komt. Wil je dat soepeler, dan is dat een besluit over wat een reeks betekent en dus van jou - zeg het en ik pas het aan.</w:t>
+      </w:r>
+    </w:p>
+    <w:p>
+      <w:r>
+        <w:t xml:space="preserve">Ter kennisgeving - de aan/uit-knop voor feestelijke momenten staat op het apparaat</w:t>
+      </w:r>
+    </w:p>
+    <w:p>
+      <w:r>
+        <w:t xml:space="preserve">QS8-76 vraagt dat vieringen uit te zetten zijn in de instellingen. Ik heb die voorkeur in de opslag van het apparaat gezet en niet in profiles, om twee redenen: een animatievoorkeur hoort bij het scherm waarop je kijkt (net als prefers-reduced-motion zelf), en een kolom toevoegen aan een bestaande tabel vraagt eerst jouw toestemming. Gevolg: de instelling reist niet mee naar een nieuwe telefoon. Wil je dat wel, dan is het een kolom in profiles en dus jouw besluit.</w:t>
+      </w:r>
+    </w:p>
+    <w:p>
+      <w:r>
+        <w:t xml:space="preserve">Ter kennisgeving - QS8-43 en QS8-44 stonden op Done terwijl je er niet bij kon</w:t>
+      </w:r>
+    </w:p>
+    <w:p>
+      <w:r>
+        <w:t xml:space="preserve">Bij QS8-112 bleek dat allebei die issues op 17-08 zijn afgevinkt toen de datalaag klaar was, terwijl er geen scherm was om een weekdoel aan te maken. De kernlus van de app was dus niet met de hand te doorlopen, en in Linear stond hij als af. Dat is het afgevinkte vakje waar CLAUDE.md voor waarschuwt, nu in de omgekeerde richting van de vorige keer: niet een gat dat als opgelost gemeld stond, maar een feature die als af gemeld stond terwijl hij onbereikbaar was. Het is nu gebouwd. Overweeg bij het afvinken van een frontend-issue voortaan de vraag: kan een mens er via het scherm bij?</w:t>
+      </w:r>
+    </w:p>
+    <w:p>
+      <w:r>
+        <w:t xml:space="preserve">Ter kennisgeving - milestones.status is client-schrijfbaar, en dat is hier waarschijnlijk juist</w:t>
+      </w:r>
+    </w:p>
+    <w:p>
+      <w:r>
+        <w:t xml:space="preserve">Bij QS8-39 nagekeken: iedereen kan zijn eigen mijlpaal op done zetten, en de trigger meld_mijlpaal() plaatst dan “X heeft een mijlpaal gehaald” in elke gekoppelde groep. Dat lijkt op A31 (goals.status) en A35 (weekly_goals.status), maar het verschil is dat een mijlpaal in dit model geen peer-goedkeuring kent: je bepaalt zelf wanneer je mijlpaal af is. Ik heb er dus niets aan veranderd.</w:t>
+      </w:r>
+    </w:p>
+    <w:p>
+      <w:r>
+        <w:t xml:space="preserve">Wat wel opvalt: de trigger vuurt opnieuw bij done, terug naar todo, en weer done. Zo kun je hetzelfde bericht herhaald in de groepschat krijgen. Het is een positief bericht, dus geen domeinregel 7-kwestie, maar het is wel een spamvector - en die hangt samen met A24, waar je nog moet beslissen of je een limiet op de chat wilt. Het scherm biedt “toch niet gehaald” aan omdat een vergissing terug moet kunnen; als je de spamvector wilt sluiten is de nette plek de trigger, niet de UI.</w:t>
       </w:r>
     </w:p>
     <w:sectPr>

</xml_diff>